<commit_message>
fix: streamline delivery information formatting in templates
</commit_message>
<xml_diff>
--- a/public/uploads/templates/apv-teklif-genel-depolama.docx
+++ b/public/uploads/templates/apv-teklif-genel-depolama.docx
@@ -3598,6 +3598,8 @@
     </w:p>
     <w:p>
       <w:pPr>
+        <w:keepNext/>
+        <w:keepLines/>
         <w:spacing w:before="160" w:after="60"/>
       </w:pPr>
       <w:r>
@@ -3612,6 +3614,7 @@
     </w:p>
     <w:p>
       <w:pPr>
+        <w:keepNext/>
         <w:spacing w:after="60"/>
         <w:jc w:val="center"/>
       </w:pPr>
@@ -3642,6 +3645,7 @@
     </w:p>
     <w:p>
       <w:pPr>
+        <w:keepNext/>
         <w:pStyle w:val="Balk1"/>
         <w:rPr>
           <w:rFonts w:ascii="Times New Roman" w:hAnsi="Times New Roman" w:cs="Times New Roman"/>
@@ -5359,231 +5363,81 @@
         </w:rPr>
       </w:pPr>
     </w:p>
-    <w:tbl>
-      <w:tblPr>
-        <w:tblStyle w:val="TableGrid"/>
-        <w:tblpPr w:vertAnchor="text" w:tblpX="284" w:tblpY="225"/>
-        <w:tblOverlap w:val="never"/>
-        <w:tblW w:w="3119" w:type="dxa"/>
-        <w:tblInd w:w="0" w:type="dxa"/>
-        <w:tblCellMar>
-          <w:top w:w="42" w:type="dxa"/>
-          <w:right w:w="115" w:type="dxa"/>
-        </w:tblCellMar>
-        <w:tblLook w:val="04A0" w:firstRow="1" w:lastRow="0" w:firstColumn="1" w:lastColumn="0" w:noHBand="0" w:noVBand="1"/>
-      </w:tblPr>
-      <w:tblGrid>
-        <w:gridCol w:w="3119"/>
-      </w:tblGrid>
-      <w:tr>
-        <w:trPr>
-          <w:trHeight w:val="250"/>
-        </w:trPr>
-        <w:tc>
-          <w:tcPr>
-            <w:tcW w:w="3119" w:type="dxa"/>
-            <w:tcBorders>
-              <w:top w:val="nil"/>
-              <w:left w:val="nil"/>
-              <w:bottom w:val="nil"/>
-              <w:right w:val="nil"/>
-            </w:tcBorders>
-            <w:shd w:val="clear" w:color="auto" w:fill="D9D9D9"/>
-          </w:tcPr>
-          <w:p>
-            <w:pPr>
-              <w:tabs>
-                <w:tab w:val="center" w:pos="2124"/>
-              </w:tabs>
-              <w:spacing w:after="0" w:line="259" w:lineRule="auto"/>
-              <w:ind w:left="0" w:right="0" w:firstLine="0"/>
-              <w:jc w:val="left"/>
-              <w:rPr>
-                <w:rFonts w:ascii="Times New Roman" w:hAnsi="Times New Roman"/>
-                <w:b/>
-                <w:sz w:val="22"/>
-                <w:szCs w:val="22"/>
-              </w:rPr>
-            </w:pPr>
-            <w:r>
-              <w:rPr>
-                <w:rFonts w:ascii="Times New Roman" w:hAnsi="Times New Roman"/>
-                <w:b/>
-                <w:sz w:val="22"/>
-                <w:szCs w:val="22"/>
-              </w:rPr>
-              <w:t>E</w:t>
-            </w:r>
-            <w:r>
-              <w:rPr>
-                <w:rFonts w:ascii="Times New Roman" w:hAnsi="Times New Roman"/>
-                <w:b/>
-                <w:sz w:val="22"/>
-                <w:szCs w:val="22"/>
-                <w:lang w:bidi="tr"/>
-              </w:rPr>
-              <w:t>STIMATED DELIVERY WEEK:</w:t>
-            </w:r>
-          </w:p>
-          <w:p>
-            <w:pPr>
-              <w:tabs>
-                <w:tab w:val="center" w:pos="2124"/>
-              </w:tabs>
-              <w:spacing w:after="0" w:line="259" w:lineRule="auto"/>
-              <w:ind w:left="0" w:right="0" w:firstLine="0"/>
-              <w:jc w:val="left"/>
-              <w:rPr>
-                <w:rFonts w:ascii="Times New Roman" w:hAnsi="Times New Roman"/>
-                <w:sz w:val="22"/>
-                <w:szCs w:val="22"/>
-              </w:rPr>
-            </w:pPr>
-            <w:r>
-              <w:rPr>
-                <w:rFonts w:ascii="Times New Roman" w:hAnsi="Times New Roman"/>
-                <w:b/>
-                <w:sz w:val="22"/>
-                <w:szCs w:val="22"/>
-              </w:rPr>
-              <w:t xml:space="preserve">DELIVERY PLACE: </w:t>
-            </w:r>
-            <w:r>
-              <w:rPr>
-                <w:rFonts w:ascii="Times New Roman" w:hAnsi="Times New Roman"/>
-                <w:b/>
-                <w:sz w:val="22"/>
-                <w:szCs w:val="22"/>
-              </w:rPr>
-              <w:tab/>
-              <w:t xml:space="preserve"> </w:t>
-            </w:r>
-          </w:p>
-        </w:tc>
-      </w:tr>
-      <w:tr>
-        <w:trPr>
-          <w:trHeight w:val="250"/>
-        </w:trPr>
-        <w:tc>
-          <w:tcPr>
-            <w:tcW w:w="3119" w:type="dxa"/>
-            <w:tcBorders>
-              <w:top w:val="nil"/>
-              <w:left w:val="nil"/>
-              <w:bottom w:val="nil"/>
-              <w:right w:val="nil"/>
-            </w:tcBorders>
-            <w:shd w:val="clear" w:color="auto" w:fill="D9D9D9"/>
-          </w:tcPr>
-          <w:p>
-            <w:pPr>
-              <w:spacing w:after="0" w:line="259" w:lineRule="auto"/>
-              <w:ind w:left="0" w:right="0" w:firstLine="0"/>
-              <w:jc w:val="left"/>
-              <w:rPr>
-                <w:rFonts w:ascii="Times New Roman" w:hAnsi="Times New Roman"/>
-                <w:sz w:val="22"/>
-                <w:szCs w:val="22"/>
-              </w:rPr>
-            </w:pPr>
-            <w:r>
-              <w:rPr>
-                <w:rFonts w:ascii="Times New Roman" w:hAnsi="Times New Roman"/>
-                <w:b/>
-                <w:sz w:val="22"/>
-                <w:szCs w:val="22"/>
-              </w:rPr>
-              <w:t>OFFER VALIDITY DAYS:</w:t>
-            </w:r>
-          </w:p>
-        </w:tc>
-      </w:tr>
-    </w:tbl>
     <w:p>
       <w:pPr>
-        <w:ind w:left="0" w:right="11" w:firstLine="0"/>
-        <w:rPr>
-          <w:rFonts w:ascii="Times New Roman" w:hAnsi="Times New Roman"/>
-          <w:sz w:val="22"/>
-          <w:szCs w:val="22"/>
-        </w:rPr>
-      </w:pPr>
+        <w:tabs>
+          <w:tab w:val="left" w:pos="3800"/>
+        </w:tabs>
+        <w:spacing w:after="40" w:line="259" w:lineRule="auto"/>
+      </w:pPr>
+      <w:r>
+        <w:rPr>
+          <w:rFonts w:ascii="Times New Roman" w:hAnsi="Times New Roman"/>
+          <w:b/>
+          <w:sz w:val="22"/>
+          <w:szCs w:val="22"/>
+        </w:rPr>
+        <w:t xml:space="preserve">ESTIMATED DELIVERY WEEK:</w:t>
+      </w:r>
+      <w:r>
+        <w:rPr>
+          <w:rFonts w:ascii="Times New Roman" w:hAnsi="Times New Roman"/>
+          <w:sz w:val="22"/>
+          <w:szCs w:val="22"/>
+        </w:rPr>
+        <w:tab/>
+        <w:t xml:space="preserve">Can be delivered within {quotation.deliveryWeeks} weeks</w:t>
+      </w:r>
     </w:p>
     <w:p>
       <w:pPr>
-        <w:spacing w:after="17" w:line="259" w:lineRule="auto"/>
-        <w:ind w:right="3262"/>
-        <w:rPr>
-          <w:rFonts w:ascii="Times New Roman" w:hAnsi="Times New Roman"/>
-          <w:sz w:val="22"/>
-          <w:szCs w:val="22"/>
-        </w:rPr>
-      </w:pPr>
-      <w:r>
-        <w:rPr>
-          <w:rFonts w:ascii="Times New Roman" w:hAnsi="Times New Roman"/>
-          <w:sz w:val="22"/>
-          <w:szCs w:val="22"/>
-        </w:rPr>
-        <w:t xml:space="preserve">Can be delivered within </w:t>
-      </w:r>
-      <w:r>
-        <w:rPr>
-          <w:rFonts w:ascii="Times New Roman" w:hAnsi="Times New Roman"/>
-          <w:sz w:val="22"/>
-          <w:szCs w:val="22"/>
-        </w:rPr>
-        <w:t xml:space="preserve">{quotation.deliveryWeeks}</w:t>
-      </w:r>
-      <w:r>
-        <w:rPr>
-          <w:rFonts w:ascii="Times New Roman" w:hAnsi="Times New Roman"/>
-          <w:sz w:val="22"/>
-          <w:szCs w:val="22"/>
-        </w:rPr>
-        <w:t xml:space="preserve"> weeks                                                                 </w:t>
+        <w:tabs>
+          <w:tab w:val="left" w:pos="3800"/>
+        </w:tabs>
+        <w:spacing w:after="40" w:line="259" w:lineRule="auto"/>
+      </w:pPr>
+      <w:r>
+        <w:rPr>
+          <w:rFonts w:ascii="Times New Roman" w:hAnsi="Times New Roman"/>
+          <w:b/>
+          <w:sz w:val="22"/>
+          <w:szCs w:val="22"/>
+        </w:rPr>
+        <w:t xml:space="preserve">DELIVERY PLACE:</w:t>
+      </w:r>
+      <w:r>
+        <w:rPr>
+          <w:rFonts w:ascii="Times New Roman" w:hAnsi="Times New Roman"/>
+          <w:sz w:val="22"/>
+          <w:szCs w:val="22"/>
+        </w:rPr>
+        <w:tab/>
+        <w:t xml:space="preserve">{quotation.deliveryPlace}</w:t>
       </w:r>
     </w:p>
     <w:p>
       <w:pPr>
-        <w:spacing w:after="17" w:line="259" w:lineRule="auto"/>
-        <w:ind w:left="284" w:right="0" w:firstLine="0"/>
-        <w:jc w:val="left"/>
-        <w:rPr>
-          <w:rFonts w:ascii="Times New Roman" w:hAnsi="Times New Roman"/>
-          <w:sz w:val="22"/>
-          <w:szCs w:val="22"/>
-        </w:rPr>
-      </w:pPr>
-      <w:r>
-        <w:rPr>
-          <w:rFonts w:ascii="Times New Roman" w:hAnsi="Times New Roman"/>
-          <w:sz w:val="22"/>
-          <w:szCs w:val="22"/>
-        </w:rPr>
-        <w:t xml:space="preserve">{quotation.deliveryPlace}</w:t>
-      </w:r>
-    </w:p>
-    <w:p>
-      <w:pPr>
-        <w:spacing w:after="0" w:line="259" w:lineRule="auto"/>
-        <w:ind w:left="284" w:right="0" w:firstLine="0"/>
-        <w:jc w:val="left"/>
-        <w:rPr>
-          <w:rFonts w:ascii="Times New Roman" w:hAnsi="Times New Roman"/>
-          <w:bCs/>
-          <w:sz w:val="22"/>
-          <w:szCs w:val="22"/>
-        </w:rPr>
-      </w:pPr>
-      <w:r>
-        <w:rPr>
-          <w:rFonts w:ascii="Times New Roman" w:hAnsi="Times New Roman"/>
-          <w:bCs/>
-          <w:sz w:val="22"/>
-          <w:szCs w:val="22"/>
-        </w:rPr>
+        <w:tabs>
+          <w:tab w:val="left" w:pos="3800"/>
+        </w:tabs>
+        <w:spacing w:after="40" w:line="259" w:lineRule="auto"/>
+      </w:pPr>
+      <w:r>
+        <w:rPr>
+          <w:rFonts w:ascii="Times New Roman" w:hAnsi="Times New Roman"/>
+          <w:b/>
+          <w:sz w:val="22"/>
+          <w:szCs w:val="22"/>
+        </w:rPr>
+        <w:t xml:space="preserve">OFFER VALIDITY DAYS:</w:t>
+      </w:r>
+      <w:r>
+        <w:rPr>
+          <w:rFonts w:ascii="Times New Roman" w:hAnsi="Times New Roman"/>
+          <w:sz w:val="22"/>
+          <w:szCs w:val="22"/>
+        </w:rPr>
+        <w:tab/>
         <w:t xml:space="preserve">{quotation.offerValidityDays} days</w:t>
       </w:r>
     </w:p>

</xml_diff>